<commit_message>
Add Optica reviewer certificate and update resume
</commit_message>
<xml_diff>
--- a/public/wisdom-benson-resume.docx
+++ b/public/wisdom-benson-resume.docx
@@ -662,13 +662,25 @@
         <w:keepLines/>
       </w:pPr>
       <w:r>
-        <w:rPr>
-          <w:rFonts w:ascii="Calibri" w:hAnsi="Calibri"/>
-          <w:color w:val="18202F"/>
-          <w:sz w:val="18"/>
-        </w:rPr>
-        <w:t>American Physical Society Student Ambassador, 2024-2025 and 2025-2026 terms.</w:t>
+        <w:t>American Physical Society Student Ambassador, 2025-2026 and 2026-2027 cohorts; Advocacy Champion, 2025-present.</w:t>
       </w:r>
+    </w:p>
+    <w:p>
+      <w:pPr>
+        <w:pStyle w:val="ListBullet"/>
+      </w:pPr>
+      <w:r>
+        <w:t xml:space="preserve">Optica Publishing Group Reviewer Certification Course, 2026. </w:t>
+      </w:r>
+      <w:hyperlink r:id="rId16">
+        <w:r>
+          <w:rPr>
+            <w:color w:val="225FD6"/>
+            <w:u w:val="single"/>
+          </w:rPr>
+          <w:t>Certificate</w:t>
+        </w:r>
+      </w:hyperlink>
     </w:p>
     <w:p>
       <w:pPr>

</xml_diff>